<commit_message>
Fill WMP solution design Overview section
Adds a short Overview to the empty section: the migration's purpose
(M365 Commercial to GCC High for CMMC 2.0 Level 2) and a bullet summary
of what the design covers. Styled to match the document (BodyText +
ListTA); pagination and TOC page numbers unchanged (45 pages).

Co-Authored-By: Claude Fable 5 <noreply@anthropic.com>
Claude-Session: https://claude.ai/code/session_01D9SFx2c7BjowTfENYrpiQo
</commit_message>
<xml_diff>
--- a/deliverables/WMP/WMP__Microsoft_Government_Cloud_Migration_Solution_Design__20260824.docx
+++ b/deliverables/WMP/WMP__Microsoft_Government_Cloud_Migration_Solution_Design__20260824.docx
@@ -6317,6 +6317,62 @@
         <w:t>Overview</w:t>
       </w:r>
       <w:bookmarkEnd w:id="593"/>
+    </w:p>
+    <w:p>
+      <w:pPr>
+        <w:pStyle w:val="BodyText"/>
+      </w:pPr>
+      <w:r>
+        <w:t xml:space="preserve">Wisconsin Metal Parts (WMP) is migrating from Microsoft 365 Commercial to Microsoft 365 GCC High in support of CMMC 2.0 Level 2 compliance. This document defines the design for that migration and for the services that will operate in the new environment:</w:t>
+      </w:r>
+    </w:p>
+    <w:p>
+      <w:pPr>
+        <w:pStyle w:val="ListTA"/>
+      </w:pPr>
+      <w:r>
+        <w:t xml:space="preserve">Microsoft 365 GCC High tenant initialization, baseline security, and workload configuration (Exchange Online, SharePoint, OneDrive, Teams).</w:t>
+      </w:r>
+    </w:p>
+    <w:p>
+      <w:pPr>
+        <w:pStyle w:val="ListTA"/>
+      </w:pPr>
+      <w:r>
+        <w:t xml:space="preserve">Teams Phone service delivered through CallTower.</w:t>
+      </w:r>
+    </w:p>
+    <w:p>
+      <w:pPr>
+        <w:pStyle w:val="ListTA"/>
+      </w:pPr>
+      <w:r>
+        <w:t xml:space="preserve">Mobile device management for corporate-owned iOS and Android devices using Microsoft Intune.</w:t>
+      </w:r>
+    </w:p>
+    <w:p>
+      <w:pPr>
+        <w:pStyle w:val="ListTA"/>
+      </w:pPr>
+      <w:r>
+        <w:t xml:space="preserve">Migration of mail, files, and collaboration data from the commercial tenant using AvePoint Fly, and migration of Windows devices to the new tenant.</w:t>
+      </w:r>
+    </w:p>
+    <w:p>
+      <w:pPr>
+        <w:pStyle w:val="ListTA"/>
+      </w:pPr>
+      <w:r>
+        <w:t xml:space="preserve">Decommission of the on-premises Exchange environment once migration is validated.</w:t>
+      </w:r>
+    </w:p>
+    <w:p>
+      <w:pPr>
+        <w:pStyle w:val="ListTA"/>
+      </w:pPr>
+      <w:r>
+        <w:t xml:space="preserve">The phased deployment approach for executing the work.</w:t>
+      </w:r>
     </w:p>
     <w:p>
       <w:pPr>

</xml_diff>

<commit_message>
Remove AI authorship references; record attribution rule
Re-author the design document's 21 working comments as "Essendis",
reword one templates/README.md sentence, and record the standing
attribution rule in the project instructions. All office packages and
repo documents verified free of such references.
</commit_message>
<xml_diff>
--- a/deliverables/WMP/WMP__Microsoft_Government_Cloud_Migration_Solution_Design__20260824.docx
+++ b/deliverables/WMP/WMP__Microsoft_Government_Cloud_Migration_Solution_Design__20260824.docx
@@ -24084,7 +24084,7 @@
       </w:r>
     </w:p>
   </w:comment>
-  <w:comment w:id="2081" w:author="Claude" w:date="2026-08-26T01:44:59Z" w:initials="C">
+  <w:comment w:id="2081" w:author="Essendis" w:date="2026-08-26T01:44:59Z" w:initials="E">
     <w:p>
       <w:r>
         <w:rPr>
@@ -24102,7 +24102,7 @@
       </w:r>
     </w:p>
   </w:comment>
-  <w:comment w:id="2082" w:author="Claude" w:date="2026-08-26T01:44:59Z" w:initials="C">
+  <w:comment w:id="2082" w:author="Essendis" w:date="2026-08-26T01:44:59Z" w:initials="E">
     <w:p>
       <w:r>
         <w:rPr>
@@ -24120,7 +24120,7 @@
       </w:r>
     </w:p>
   </w:comment>
-  <w:comment w:id="2083" w:author="Claude" w:date="2026-08-26T01:44:59Z" w:initials="C">
+  <w:comment w:id="2083" w:author="Essendis" w:date="2026-08-26T01:44:59Z" w:initials="E">
     <w:p>
       <w:r>
         <w:rPr>
@@ -24138,7 +24138,7 @@
       </w:r>
     </w:p>
   </w:comment>
-  <w:comment w:id="2084" w:author="Claude" w:date="2026-08-26T01:44:59Z" w:initials="C">
+  <w:comment w:id="2084" w:author="Essendis" w:date="2026-08-26T01:44:59Z" w:initials="E">
     <w:p>
       <w:r>
         <w:rPr>
@@ -24156,7 +24156,7 @@
       </w:r>
     </w:p>
   </w:comment>
-  <w:comment w:id="2085" w:author="Claude" w:date="2026-08-26T01:44:59Z" w:initials="C">
+  <w:comment w:id="2085" w:author="Essendis" w:date="2026-08-26T01:44:59Z" w:initials="E">
     <w:p>
       <w:r>
         <w:rPr>
@@ -24174,7 +24174,7 @@
       </w:r>
     </w:p>
   </w:comment>
-  <w:comment w:id="2086" w:author="Claude" w:date="2026-08-26T01:44:59Z" w:initials="C">
+  <w:comment w:id="2086" w:author="Essendis" w:date="2026-08-26T01:44:59Z" w:initials="E">
     <w:p>
       <w:r>
         <w:rPr>
@@ -24192,7 +24192,7 @@
       </w:r>
     </w:p>
   </w:comment>
-  <w:comment w:id="2087" w:author="Claude" w:date="2026-08-26T01:44:59Z" w:initials="C">
+  <w:comment w:id="2087" w:author="Essendis" w:date="2026-08-26T01:44:59Z" w:initials="E">
     <w:p>
       <w:r>
         <w:rPr>
@@ -24210,7 +24210,7 @@
       </w:r>
     </w:p>
   </w:comment>
-  <w:comment w:id="2088" w:author="Claude" w:date="2026-08-26T01:44:59Z" w:initials="C">
+  <w:comment w:id="2088" w:author="Essendis" w:date="2026-08-26T01:44:59Z" w:initials="E">
     <w:p>
       <w:r>
         <w:rPr>
@@ -24228,7 +24228,7 @@
       </w:r>
     </w:p>
   </w:comment>
-  <w:comment w:id="2089" w:author="Claude" w:date="2026-08-26T01:44:59Z" w:initials="C">
+  <w:comment w:id="2089" w:author="Essendis" w:date="2026-08-26T01:44:59Z" w:initials="E">
     <w:p>
       <w:r>
         <w:rPr>
@@ -24246,7 +24246,7 @@
       </w:r>
     </w:p>
   </w:comment>
-  <w:comment w:id="2090" w:author="Claude" w:date="2026-08-26T01:44:59Z" w:initials="C">
+  <w:comment w:id="2090" w:author="Essendis" w:date="2026-08-26T01:44:59Z" w:initials="E">
     <w:p>
       <w:r>
         <w:rPr>
@@ -24264,7 +24264,7 @@
       </w:r>
     </w:p>
   </w:comment>
-  <w:comment w:id="2091" w:author="Claude" w:date="2026-08-26T01:44:59Z" w:initials="C">
+  <w:comment w:id="2091" w:author="Essendis" w:date="2026-08-26T01:44:59Z" w:initials="E">
     <w:p>
       <w:r>
         <w:rPr>
@@ -24282,7 +24282,7 @@
       </w:r>
     </w:p>
   </w:comment>
-  <w:comment w:id="2092" w:author="Claude" w:date="2026-08-26T01:44:59Z" w:initials="C">
+  <w:comment w:id="2092" w:author="Essendis" w:date="2026-08-26T01:44:59Z" w:initials="E">
     <w:p>
       <w:r>
         <w:rPr>
@@ -24300,7 +24300,7 @@
       </w:r>
     </w:p>
   </w:comment>
-  <w:comment w:id="2093" w:author="Claude" w:date="2026-08-26T01:44:59Z" w:initials="C">
+  <w:comment w:id="2093" w:author="Essendis" w:date="2026-08-26T01:44:59Z" w:initials="E">
     <w:p>
       <w:r>
         <w:rPr>
@@ -24318,7 +24318,7 @@
       </w:r>
     </w:p>
   </w:comment>
-  <w:comment w:id="2094" w:author="Claude" w:date="2026-08-26T01:44:59Z" w:initials="C">
+  <w:comment w:id="2094" w:author="Essendis" w:date="2026-08-26T01:44:59Z" w:initials="E">
     <w:p>
       <w:r>
         <w:rPr>
@@ -24336,7 +24336,7 @@
       </w:r>
     </w:p>
   </w:comment>
-  <w:comment w:id="2095" w:author="Claude" w:date="2026-08-26T01:44:59Z" w:initials="C">
+  <w:comment w:id="2095" w:author="Essendis" w:date="2026-08-26T01:44:59Z" w:initials="E">
     <w:p>
       <w:r>
         <w:rPr>
@@ -24354,7 +24354,7 @@
       </w:r>
     </w:p>
   </w:comment>
-  <w:comment w:id="2096" w:author="Claude" w:date="2026-08-26T01:44:59Z" w:initials="C">
+  <w:comment w:id="2096" w:author="Essendis" w:date="2026-08-26T01:44:59Z" w:initials="E">
     <w:p>
       <w:r>
         <w:rPr>
@@ -24372,7 +24372,7 @@
       </w:r>
     </w:p>
   </w:comment>
-  <w:comment w:id="2097" w:author="Claude" w:date="2026-08-26T01:44:59Z" w:initials="C">
+  <w:comment w:id="2097" w:author="Essendis" w:date="2026-08-26T01:44:59Z" w:initials="E">
     <w:p>
       <w:r>
         <w:rPr>
@@ -24390,7 +24390,7 @@
       </w:r>
     </w:p>
   </w:comment>
-  <w:comment w:id="2098" w:author="Claude" w:date="2026-08-26T01:44:59Z" w:initials="C">
+  <w:comment w:id="2098" w:author="Essendis" w:date="2026-08-26T01:44:59Z" w:initials="E">
     <w:p>
       <w:r>
         <w:rPr>
@@ -24408,7 +24408,7 @@
       </w:r>
     </w:p>
   </w:comment>
-  <w:comment w:id="2099" w:author="Claude" w:date="2026-08-26T01:44:59Z" w:initials="C">
+  <w:comment w:id="2099" w:author="Essendis" w:date="2026-08-26T01:44:59Z" w:initials="E">
     <w:p>
       <w:r>
         <w:rPr>
@@ -24426,7 +24426,7 @@
       </w:r>
     </w:p>
   </w:comment>
-  <w:comment w:id="2100" w:author="Claude" w:date="2026-08-26T01:44:59Z" w:initials="C">
+  <w:comment w:id="2100" w:author="Essendis" w:date="2026-08-26T01:44:59Z" w:initials="E">
     <w:p>
       <w:r>
         <w:rPr>
@@ -24444,7 +24444,7 @@
       </w:r>
     </w:p>
   </w:comment>
-  <w:comment w:id="2101" w:author="Claude" w:date="2026-08-26T01:44:59Z" w:initials="C">
+  <w:comment w:id="2101" w:author="Essendis" w:date="2026-08-26T01:44:59Z" w:initials="E">
     <w:p>
       <w:r>
         <w:rPr>

</xml_diff>